<commit_message>
Integrate IMN operational energy impacts and Codex model governance
</commit_message>
<xml_diff>
--- a/outputs/documentos_tfg/conclusiones_desarrolladas_tfg.docx
+++ b/outputs/documentos_tfg/conclusiones_desarrolladas_tfg.docx
@@ -66,7 +66,7 @@
           <w:rFonts w:ascii="Times New Roman" w:hAnsi="Times New Roman"/>
           <w:sz w:val="24"/>
         </w:rPr>
-        <w:t>El inventario de ciclo de vida representó y cuantificó las rutas diferenciadas de manejo del estiércol en los dos escenarios, a partir de un flujo anual común de 26 278,725181 kg de estiércol fresco. En el Escenario A, 66,69 % ingresó a la ruta sólida mediante A1: Precomposteo; posteriormente, la masa resultante continuó hacia A2: Lombricompostaje, mientras que 33,31 % se incorporó a las aguas verdes. En el Escenario B, el 100 % ingresó al sistema de purines. De este modo, el inventario caracterizó las trayectorias de manejo y los flujos asociados a cada alternativa estudiada. El inventario incorporó además 53,23 kWh/año de electricidad en A3 o B1 y 182,50 L/año de diésel en A4 o B2; sus procesos de fondo permanecen pendientes.</w:t>
+        <w:t>El inventario de ciclo de vida representó y cuantificó las rutas diferenciadas de manejo del estiércol en los dos escenarios, a partir de un flujo anual común de 26 278,725181 kg de estiércol fresco. En el Escenario A, 66,69 % ingresó a la ruta sólida mediante A1: Precomposteo; posteriormente, la masa resultante continuó hacia A2: Lombricompostaje, mientras que 33,31 % se incorporó a las aguas verdes. En el Escenario B, el 100 % ingresó al sistema de purines. De este modo, el inventario caracterizó las trayectorias de manejo y los flujos asociados a cada alternativa estudiada. El inventario incorporó además 53,23 kWh/año de electricidad en A3 o B1 y 182,50 L/año de diésel en A4 o B2; la electricidad se evaluó mediante el factor IMN agregado de consumo 2025, proxy temporal de la operación observada en 2026, y las emisiones físicas IMN del diésel se caracterizaron con EF 3.1. El total climático combina ambos aportes con el manejo del estiércol, sin cadenas de fondo ecoinvent.</w:t>
       </w:r>
     </w:p>
     <w:p>
@@ -80,7 +80,7 @@
           <w:rFonts w:ascii="Times New Roman" w:hAnsi="Times New Roman"/>
           <w:sz w:val="24"/>
         </w:rPr>
-        <w:t>Las cargas ambientales se concentraron en etapas específicas, que variaron según el escenario y la categoría. En calentamiento global, A3: Almacenamiento de aguas verdes aportó 63,53 % del total del Escenario A y B1: Almacenamiento de purines aportó 88,80 % del total del Escenario B. En eutrofización terrestre, A1: Precomposteo aportó 47,44 % del total del Escenario A y B2: Aplicación de purines en campo de pastoreo aportó 62,92 % del total del Escenario B. En eutrofización marina, A4: Aplicación de aguas verdes en campos de pastoreo aportó 70,63 % del total del Escenario A y B2: Aplicación de purines en campo de pastoreo aportó 93,14 % del total del Escenario B. La evaluación por etapa identificó así patrones de concentración diferenciados entre las alternativas estudiadas.</w:t>
+        <w:t>Las cargas ambientales se concentraron en etapas específicas, que variaron según el escenario y la categoría. En calentamiento global, A3: Almacenamiento de aguas verdes aportó 53,93 % del total del Escenario A y B1: Almacenamiento de purines aportó 81,99 % del total del Escenario B. En eutrofización terrestre, A1: Precomposteo aportó 47,44 % del total del Escenario A y B2: Aplicación de purines en campo de pastoreo aportó 62,92 % del total del Escenario B. En eutrofización marina, A4: Aplicación de aguas verdes en campos de pastoreo aportó 70,63 % del total del Escenario A y B2: Aplicación de purines en campo de pastoreo aportó 93,14 % del total del Escenario B. La evaluación por etapa identificó así patrones de concentración diferenciados entre las alternativas estudiadas.</w:t>
       </w:r>
     </w:p>
     <w:p>
@@ -94,7 +94,7 @@
           <w:rFonts w:ascii="Times New Roman" w:hAnsi="Times New Roman"/>
           <w:sz w:val="24"/>
         </w:rPr>
-        <w:t>Para calentamiento global, el Escenario B presentó el mayor impacto por unidad funcional: 0,220 kg CO₂-eq/kg de estiércol fresco manejado, frente a 0,102 kg CO₂-eq/kg de estiércol fresco manejado en el Escenario A. La diferencia B menos A fue de 114,75 % respecto a A, lo que evidenció un menor indicador para el Escenario A bajo las condiciones estudiadas.</w:t>
+        <w:t>Para calentamiento global, el Escenario B presentó el mayor impacto por unidad funcional: 0,238 kg CO₂-eq/kg de estiércol fresco manejado, frente a 0,121 kg CO₂-eq/kg de estiércol fresco manejado en el Escenario A. La diferencia B menos A fue de 97,29 % respecto a A, lo que evidenció un menor indicador para el Escenario A bajo las condiciones estudiadas.</w:t>
       </w:r>
     </w:p>
     <w:p>

</xml_diff>

<commit_message>
Standardize scientific numerical precision in thesis
</commit_message>
<xml_diff>
--- a/outputs/documentos_tfg/conclusiones_desarrolladas_tfg.docx
+++ b/outputs/documentos_tfg/conclusiones_desarrolladas_tfg.docx
@@ -66,7 +66,7 @@
           <w:rFonts w:ascii="Times New Roman" w:hAnsi="Times New Roman"/>
           <w:sz w:val="24"/>
         </w:rPr>
-        <w:t>El inventario de ciclo de vida representó y cuantificó las rutas diferenciadas de manejo del estiércol en los dos escenarios, a partir de un flujo anual común de aproximadamente 26 278,7 kg de estiércol fresco. En el Escenario A, 66,69 % ingresó a la ruta sólida mediante A1: Precomposteo; posteriormente, la masa resultante continuó hacia A2: Lombricompostaje, mientras que 33,31 % se incorporó a las aguas verdes. En el Escenario B, el 100 % ingresó al sistema de purines. De este modo, el inventario caracterizó las trayectorias de manejo y los flujos asociados a cada alternativa estudiada. El inventario incorporó además 53,23 kWh/año de electricidad en A3 o B1 y 182,50 L/año de diésel en A4 o B2; la electricidad se evaluó mediante el factor IMN agregado de consumo 2025, como aproximación temporal de la operación observada en 2026, y las emisiones físicas IMN del diésel se caracterizaron con EF 3.1. El total climático combina ambos aportes con el manejo del estiércol, sin cadenas de fondo ecoinvent.</w:t>
+        <w:t>El inventario de ciclo de vida representó y cuantificó las rutas diferenciadas de manejo del estiércol en los dos escenarios, a partir de un flujo anual común de aproximadamente 26 278,7 kg de estiércol fresco. En el Escenario A, 66,7 % ingresó a la ruta sólida mediante A1: Precomposteo; posteriormente, la masa resultante continuó hacia A2: Lombricompostaje, mientras que 33,3 % se incorporó a las aguas verdes. En el Escenario B, el 100 % ingresó al sistema de purines. De este modo, el inventario caracterizó las trayectorias de manejo y los flujos asociados a cada alternativa estudiada. El inventario incorporó además 53,23 kWh/año de electricidad en A3 o B1 y 182,5 L/año de diésel en A4 o B2; la electricidad se evaluó mediante el factor IMN agregado de consumo 2025, como aproximación temporal de la operación observada en 2026, y las emisiones físicas IMN del diésel se caracterizaron con EF 3.1. El total climático combina ambos aportes con el manejo del estiércol, sin cadenas de fondo ecoinvent.</w:t>
       </w:r>
     </w:p>
     <w:p>
@@ -80,7 +80,7 @@
           <w:rFonts w:ascii="Times New Roman" w:hAnsi="Times New Roman"/>
           <w:sz w:val="24"/>
         </w:rPr>
-        <w:t>Las cargas ambientales se concentraron en etapas específicas, que variaron según el escenario y la categoría. En calentamiento global, A3: Almacenamiento de aguas verdes aportó 53,93 % del total del Escenario A y B1: Almacenamiento de purines aportó 81,99 % del total del Escenario B. En eutrofización terrestre, A1: Precomposteo aportó 47,44 % del total del Escenario A y B2: Aplicación de purines en campo de pastoreo aportó 62,92 % del total del Escenario B. En eutrofización marina, A4: Aplicación de aguas verdes en campos de pastoreo aportó 70,63 % del total del Escenario A y B2: Aplicación de purines en campo de pastoreo aportó 93,14 % del total del Escenario B. La evaluación por etapa identificó así patrones de concentración diferenciados entre las alternativas estudiadas.</w:t>
+        <w:t>Las cargas ambientales se concentraron en etapas específicas, que variaron según el escenario y la categoría. En calentamiento global, A3: Almacenamiento de aguas verdes aportó 53,9 % del total del Escenario A y B1: Almacenamiento de purines aportó 82 % del total del Escenario B. En eutrofización terrestre, A1: Precomposteo aportó 47,4 % del total del Escenario A y B2: Aplicación de purines en campo de pastoreo aportó 62,9 % del total del Escenario B. En eutrofización marina, A4: Aplicación de aguas verdes en campos de pastoreo aportó 70,6 % del total del Escenario A y B2: Aplicación de purines en campo de pastoreo aportó 93,1 % del total del Escenario B. La evaluación por etapa identificó así patrones de concentración diferenciados entre las alternativas estudiadas.</w:t>
       </w:r>
     </w:p>
     <w:p>
@@ -94,7 +94,7 @@
           <w:rFonts w:ascii="Times New Roman" w:hAnsi="Times New Roman"/>
           <w:sz w:val="24"/>
         </w:rPr>
-        <w:t>Para calentamiento global, el Escenario B presentó el mayor impacto por unidad funcional: 0,238 kg CO₂-eq/kg de estiércol fresco manejado, frente a 0,121 kg CO₂-eq/kg de estiércol fresco manejado en el Escenario A. La diferencia B menos A fue de 97,29 % respecto a A, lo que evidenció un menor indicador para el Escenario A bajo las condiciones estudiadas.</w:t>
+        <w:t>Para calentamiento global, el Escenario B presentó el mayor impacto por unidad funcional: 0,238 kg CO₂-eq/kg de estiércol fresco manejado, frente a 0,1206 kg CO₂-eq/kg de estiércol fresco manejado en el Escenario A. La diferencia B menos A fue de 97,3 % respecto a A, lo que evidenció un menor indicador para el Escenario A bajo las condiciones estudiadas.</w:t>
       </w:r>
     </w:p>
     <w:p>
@@ -108,7 +108,7 @@
           <w:rFonts w:ascii="Times New Roman" w:hAnsi="Times New Roman"/>
           <w:sz w:val="24"/>
         </w:rPr>
-        <w:t>Para eutrofización marina EF 3.1, el Escenario B presentó el mayor impacto por unidad funcional: 0,001356 kg N-eq/kg de estiércol fresco manejado, frente a 0,000595 kg N-eq/kg en el Escenario A. La diferencia B menos A fue de 127,64 % respecto a A. Para eutrofización terrestre, el Escenario B también presentó el mayor impacto por unidad funcional: 0,036580 mol N-eq/kg de estiércol fresco manejado, frente a 0,023481 mol N-eq/kg en el Escenario A; la diferencia B menos A fue de 55,78 % respecto a A.</w:t>
+        <w:t>Para eutrofización marina EF 3.1, el Escenario B presentó el mayor impacto por unidad funcional: 0,001356 kg N-eq/kg de estiércol fresco manejado, frente a 5,955 × 10⁻⁴ kg N-eq/kg en el Escenario A. La diferencia B menos A fue de 127,6 % respecto a A. Para eutrofización terrestre, el Escenario B también presentó el mayor impacto por unidad funcional: 0,03658 mol N-eq/kg de estiércol fresco manejado, frente a 0,02348 mol N-eq/kg en el Escenario A; la diferencia B menos A fue de 55,8 % respecto a A.</w:t>
       </w:r>
     </w:p>
     <w:p>

</xml_diff>